<commit_message>
chaps 0 and 6
</commit_message>
<xml_diff>
--- a/draft/Thompson_RevolutionaryGospel_20250316.docx
+++ b/draft/Thompson_RevolutionaryGospel_20250316.docx
@@ -4501,9 +4501,9 @@
           <w:rFonts w:ascii="Liberation Serif" w:hAnsi="Liberation Serif" w:cs="Liberation Serif"/>
         </w:rPr>
       </w:pPr>
-      <w:bookmarkStart w:id="7" w:name="_Toc83122279"/>
+      <w:bookmarkStart w:id="7" w:name="_Toc710942442"/>
       <w:bookmarkStart w:id="8" w:name="_Toc86750986"/>
-      <w:bookmarkStart w:id="9" w:name="_Toc710942442"/>
+      <w:bookmarkStart w:id="9" w:name="_Toc83122279"/>
       <w:r>
         <w:rPr>
           <w:rFonts w:cs="Liberation Serif"/>
@@ -5769,8 +5769,8 @@
           <w:rFonts w:ascii="Liberation Serif" w:hAnsi="Liberation Serif" w:cs="Liberation Serif"/>
         </w:rPr>
       </w:pPr>
-      <w:bookmarkStart w:id="10" w:name="_Toc1920709282"/>
-      <w:bookmarkStart w:id="11" w:name="_Toc1716883531"/>
+      <w:bookmarkStart w:id="10" w:name="_Toc1716883531"/>
+      <w:bookmarkStart w:id="11" w:name="_Toc1920709282"/>
       <w:r>
         <w:rPr>
           <w:rFonts w:cs="Liberation Serif"/>
@@ -5849,8 +5849,8 @@
           <w:rFonts w:ascii="Liberation Serif" w:hAnsi="Liberation Serif" w:cs="Liberation Serif"/>
         </w:rPr>
       </w:pPr>
-      <w:bookmarkStart w:id="12" w:name="_Toc2084481624"/>
-      <w:bookmarkStart w:id="13" w:name="_Toc495164677"/>
+      <w:bookmarkStart w:id="12" w:name="_Toc495164677"/>
+      <w:bookmarkStart w:id="13" w:name="_Toc2084481624"/>
       <w:r>
         <w:rPr>
           <w:rFonts w:cs="Liberation Serif"/>
@@ -6483,8 +6483,8 @@
           <w:rFonts w:ascii="Liberation Serif" w:hAnsi="Liberation Serif" w:cs="Liberation Serif"/>
         </w:rPr>
       </w:pPr>
-      <w:bookmarkStart w:id="14" w:name="_Toc1886491454"/>
-      <w:bookmarkStart w:id="15" w:name="_Toc356802807"/>
+      <w:bookmarkStart w:id="14" w:name="_Toc356802807"/>
+      <w:bookmarkStart w:id="15" w:name="_Toc1886491454"/>
       <w:r>
         <w:rPr>
           <w:rFonts w:cs="Liberation Serif"/>
@@ -7064,8 +7064,8 @@
           <w:rFonts w:ascii="Liberation Serif" w:hAnsi="Liberation Serif" w:cs="Liberation Serif"/>
         </w:rPr>
       </w:pPr>
-      <w:bookmarkStart w:id="16" w:name="_Toc1965849644"/>
-      <w:bookmarkStart w:id="17" w:name="_Toc735062869"/>
+      <w:bookmarkStart w:id="16" w:name="_Toc735062869"/>
+      <w:bookmarkStart w:id="17" w:name="_Toc1965849644"/>
       <w:r>
         <w:rPr>
           <w:rFonts w:cs="Liberation Serif"/>
@@ -8112,8 +8112,8 @@
           <w:rFonts w:ascii="Liberation Serif" w:hAnsi="Liberation Serif" w:cs="Liberation Serif"/>
         </w:rPr>
       </w:pPr>
-      <w:bookmarkStart w:id="18" w:name="_Toc1569653502"/>
-      <w:bookmarkStart w:id="19" w:name="_Toc138620421"/>
+      <w:bookmarkStart w:id="18" w:name="_Toc138620421"/>
+      <w:bookmarkStart w:id="19" w:name="_Toc1569653502"/>
       <w:r>
         <w:rPr>
           <w:rFonts w:cs="Liberation Serif"/>
@@ -13383,7 +13383,7 @@
       </w:r>
       <w:r>
         <w:rPr>
-          <w:rStyle w:val="FootnoteCharacters"/>
+          <w:rStyle w:val="FootnoteCharactersuser"/>
           <w:rFonts w:eastAsia="Times New Roman" w:cs="Times New Roman"/>
           <w:position w:val="0"/>
           <w:sz w:val="24"/>
@@ -13405,7 +13405,7 @@
       </w:r>
       <w:r>
         <w:rPr>
-          <w:rStyle w:val="FootnoteCharacters"/>
+          <w:rStyle w:val="FootnoteCharactersuser"/>
           <w:rFonts w:eastAsia="Times New Roman" w:cs="Times New Roman"/>
           <w:position w:val="0"/>
           <w:sz w:val="24"/>
@@ -13427,7 +13427,7 @@
       </w:r>
       <w:r>
         <w:rPr>
-          <w:rStyle w:val="FootnoteCharacters"/>
+          <w:rStyle w:val="FootnoteCharactersuser"/>
           <w:rFonts w:eastAsia="Times New Roman" w:cs="Times New Roman"/>
           <w:position w:val="0"/>
           <w:sz w:val="24"/>
@@ -13449,7 +13449,7 @@
       </w:r>
       <w:r>
         <w:rPr>
-          <w:rStyle w:val="FootnoteCharacters"/>
+          <w:rStyle w:val="FootnoteCharactersuser"/>
           <w:rFonts w:eastAsia="Times New Roman" w:cs="Times New Roman"/>
           <w:position w:val="0"/>
           <w:sz w:val="24"/>
@@ -13461,7 +13461,7 @@
       </w:r>
       <w:r>
         <w:rPr>
-          <w:rStyle w:val="FootnoteCharacters"/>
+          <w:rStyle w:val="FootnoteCharactersuser"/>
           <w:rFonts w:eastAsia="Times New Roman" w:cs="Times New Roman"/>
           <w:i/>
           <w:iCs/>
@@ -13475,7 +13475,7 @@
       </w:r>
       <w:r>
         <w:rPr>
-          <w:rStyle w:val="FootnoteCharacters"/>
+          <w:rStyle w:val="FootnoteCharactersuser"/>
           <w:rFonts w:eastAsia="Times New Roman" w:cs="Times New Roman"/>
           <w:i w:val="false"/>
           <w:iCs w:val="false"/>
@@ -13499,7 +13499,7 @@
       </w:r>
       <w:r>
         <w:rPr>
-          <w:rStyle w:val="FootnoteCharacters"/>
+          <w:rStyle w:val="FootnoteCharactersuser"/>
           <w:rFonts w:eastAsia="Times New Roman" w:cs="Times New Roman"/>
           <w:position w:val="0"/>
           <w:sz w:val="24"/>
@@ -13511,7 +13511,7 @@
       </w:r>
       <w:r>
         <w:rPr>
-          <w:rStyle w:val="FootnoteCharacters"/>
+          <w:rStyle w:val="FootnoteCharactersuser"/>
           <w:rFonts w:eastAsia="Times New Roman" w:cs="Times New Roman"/>
           <w:i/>
           <w:iCs/>
@@ -13525,7 +13525,7 @@
       </w:r>
       <w:r>
         <w:rPr>
-          <w:rStyle w:val="FootnoteCharacters"/>
+          <w:rStyle w:val="FootnoteCharactersuser"/>
           <w:rFonts w:eastAsia="Times New Roman" w:cs="Times New Roman"/>
           <w:i w:val="false"/>
           <w:iCs w:val="false"/>
@@ -13539,7 +13539,7 @@
       </w:r>
       <w:r>
         <w:rPr>
-          <w:rStyle w:val="FootnoteCharacters"/>
+          <w:rStyle w:val="FootnoteCharactersuser"/>
           <w:rFonts w:eastAsia="Times New Roman" w:cs="Times New Roman"/>
           <w:position w:val="0"/>
           <w:sz w:val="24"/>
@@ -13561,7 +13561,7 @@
       </w:pPr>
       <w:r>
         <w:rPr>
-          <w:rStyle w:val="FootnoteCharacters"/>
+          <w:rStyle w:val="FootnoteCharactersuser"/>
           <w:rFonts w:eastAsia="Times New Roman" w:cs="Times New Roman"/>
           <w:position w:val="0"/>
           <w:sz w:val="24"/>
@@ -13583,7 +13583,7 @@
       </w:r>
       <w:r>
         <w:rPr>
-          <w:rStyle w:val="FootnoteCharacters"/>
+          <w:rStyle w:val="FootnoteCharactersuser"/>
           <w:rFonts w:eastAsia="Times New Roman" w:cs="Times New Roman"/>
           <w:position w:val="0"/>
           <w:sz w:val="24"/>
@@ -13605,7 +13605,7 @@
       </w:r>
       <w:r>
         <w:rPr>
-          <w:rStyle w:val="FootnoteCharacters"/>
+          <w:rStyle w:val="FootnoteCharactersuser"/>
           <w:rFonts w:eastAsia="Times New Roman" w:cs="Times New Roman"/>
           <w:position w:val="0"/>
           <w:sz w:val="24"/>
@@ -13627,7 +13627,7 @@
       </w:r>
       <w:r>
         <w:rPr>
-          <w:rStyle w:val="FootnoteCharacters"/>
+          <w:rStyle w:val="FootnoteCharactersuser"/>
           <w:rFonts w:eastAsia="Times New Roman" w:cs="Times New Roman"/>
           <w:position w:val="0"/>
           <w:sz w:val="24"/>
@@ -13649,7 +13649,7 @@
       </w:r>
       <w:r>
         <w:rPr>
-          <w:rStyle w:val="FootnoteCharacters"/>
+          <w:rStyle w:val="FootnoteCharactersuser"/>
           <w:rFonts w:eastAsia="Times New Roman" w:cs="Times New Roman"/>
           <w:position w:val="0"/>
           <w:sz w:val="24"/>
@@ -13672,7 +13672,7 @@
       </w:r>
       <w:r>
         <w:rPr>
-          <w:rStyle w:val="FootnoteCharacters"/>
+          <w:rStyle w:val="FootnoteCharactersuser"/>
           <w:rFonts w:eastAsia="Times New Roman" w:cs="Times New Roman"/>
           <w:position w:val="0"/>
           <w:sz w:val="24"/>
@@ -13694,7 +13694,7 @@
       </w:r>
       <w:r>
         <w:rPr>
-          <w:rStyle w:val="FootnoteCharacters"/>
+          <w:rStyle w:val="FootnoteCharactersuser"/>
           <w:rFonts w:eastAsia="Times New Roman" w:cs="Times New Roman"/>
           <w:position w:val="0"/>
           <w:sz w:val="24"/>
@@ -13706,7 +13706,7 @@
       </w:r>
       <w:r>
         <w:rPr>
-          <w:rStyle w:val="FootnoteCharacters"/>
+          <w:rStyle w:val="FootnoteCharactersuser"/>
           <w:rFonts w:eastAsia="Times New Roman" w:cs="Times New Roman"/>
           <w:i w:val="false"/>
           <w:iCs w:val="false"/>
@@ -13730,7 +13730,7 @@
       </w:pPr>
       <w:r>
         <w:rPr>
-          <w:rStyle w:val="FootnoteCharacters"/>
+          <w:rStyle w:val="FootnoteCharactersuser"/>
           <w:rFonts w:eastAsia="Times New Roman" w:cs="Times New Roman"/>
           <w:position w:val="0"/>
           <w:sz w:val="24"/>
@@ -13742,7 +13742,7 @@
       </w:r>
       <w:r>
         <w:rPr>
-          <w:rStyle w:val="FootnoteCharacters"/>
+          <w:rStyle w:val="FootnoteCharactersuser"/>
           <w:rFonts w:eastAsia="Times New Roman" w:cs="Times New Roman"/>
           <w:i/>
           <w:iCs/>
@@ -13756,7 +13756,7 @@
       </w:r>
       <w:r>
         <w:rPr>
-          <w:rStyle w:val="FootnoteCharacters"/>
+          <w:rStyle w:val="FootnoteCharactersuser"/>
           <w:rFonts w:eastAsia="Times New Roman" w:cs="Times New Roman"/>
           <w:i w:val="false"/>
           <w:iCs w:val="false"/>
@@ -13770,7 +13770,7 @@
       </w:r>
       <w:r>
         <w:rPr>
-          <w:rStyle w:val="FootnoteCharacters"/>
+          <w:rStyle w:val="FootnoteCharactersuser"/>
           <w:rFonts w:eastAsia="Times New Roman" w:cs="Times New Roman"/>
           <w:i/>
           <w:iCs/>
@@ -13784,7 +13784,7 @@
       </w:r>
       <w:r>
         <w:rPr>
-          <w:rStyle w:val="FootnoteCharacters"/>
+          <w:rStyle w:val="FootnoteCharactersuser"/>
           <w:rFonts w:eastAsia="Times New Roman" w:cs="Times New Roman"/>
           <w:i w:val="false"/>
           <w:iCs w:val="false"/>
@@ -13810,7 +13810,7 @@
       </w:r>
       <w:r>
         <w:rPr>
-          <w:rStyle w:val="FootnoteCharacters"/>
+          <w:rStyle w:val="FootnoteCharactersuser"/>
           <w:rFonts w:eastAsia="Times New Roman" w:cs="Times New Roman"/>
           <w:i w:val="false"/>
           <w:iCs w:val="false"/>
@@ -13834,7 +13834,7 @@
       </w:pPr>
       <w:r>
         <w:rPr>
-          <w:rStyle w:val="FootnoteCharacters"/>
+          <w:rStyle w:val="FootnoteCharactersuser"/>
           <w:rFonts w:eastAsia="Times New Roman" w:cs="Times New Roman"/>
           <w:i w:val="false"/>
           <w:iCs w:val="false"/>
@@ -13848,7 +13848,7 @@
       </w:r>
       <w:r>
         <w:rPr>
-          <w:rStyle w:val="FootnoteCharacters"/>
+          <w:rStyle w:val="FootnoteCharactersuser"/>
           <w:rFonts w:eastAsia="Times New Roman" w:cs="Times New Roman"/>
           <w:i/>
           <w:iCs/>
@@ -13862,7 +13862,7 @@
       </w:r>
       <w:r>
         <w:rPr>
-          <w:rStyle w:val="FootnoteCharacters"/>
+          <w:rStyle w:val="FootnoteCharactersuser"/>
           <w:rFonts w:eastAsia="Times New Roman" w:cs="Times New Roman"/>
           <w:i w:val="false"/>
           <w:iCs w:val="false"/>
@@ -13876,7 +13876,7 @@
       </w:r>
       <w:r>
         <w:rPr>
-          <w:rStyle w:val="FootnoteCharacters"/>
+          <w:rStyle w:val="FootnoteCharactersuser"/>
           <w:rFonts w:eastAsia="Times New Roman" w:cs="Times New Roman"/>
           <w:i/>
           <w:iCs/>
@@ -13890,7 +13890,7 @@
       </w:r>
       <w:r>
         <w:rPr>
-          <w:rStyle w:val="FootnoteCharacters"/>
+          <w:rStyle w:val="FootnoteCharactersuser"/>
           <w:rFonts w:eastAsia="Times New Roman" w:cs="Times New Roman"/>
           <w:i w:val="false"/>
           <w:iCs w:val="false"/>
@@ -13904,7 +13904,7 @@
       </w:r>
       <w:r>
         <w:rPr>
-          <w:rStyle w:val="FootnoteCharacters"/>
+          <w:rStyle w:val="FootnoteCharactersuser"/>
           <w:rFonts w:eastAsia="Times New Roman" w:cs="Times New Roman"/>
           <w:i/>
           <w:iCs/>
@@ -13918,7 +13918,7 @@
       </w:r>
       <w:r>
         <w:rPr>
-          <w:rStyle w:val="FootnoteCharacters"/>
+          <w:rStyle w:val="FootnoteCharactersuser"/>
           <w:rFonts w:eastAsia="Times New Roman" w:cs="Times New Roman"/>
           <w:i w:val="false"/>
           <w:iCs w:val="false"/>
@@ -13939,7 +13939,7 @@
         <w:ind w:hanging="0"/>
         <w:jc w:val="start"/>
         <w:rPr>
-          <w:rStyle w:val="FootnoteCharacters"/>
+          <w:rStyle w:val="FootnoteCharactersuser"/>
           <w:rFonts w:eastAsia="Times New Roman" w:cs="Times New Roman"/>
           <w:i w:val="false"/>
           <w:i w:val="false"/>
@@ -17922,7 +17922,7 @@
       </w:r>
       <w:r>
         <w:rPr>
-          <w:rStyle w:val="FootnoteCharacters"/>
+          <w:rStyle w:val="FootnoteCharactersuser"/>
           <w:rFonts w:eastAsia="Times New Roman" w:cs="Times New Roman"/>
           <w:i w:val="false"/>
           <w:iCs w:val="false"/>
@@ -17933,7 +17933,7 @@
       </w:r>
       <w:r>
         <w:rPr>
-          <w:rStyle w:val="FootnoteCharacters"/>
+          <w:rStyle w:val="FootnoteCharactersuser"/>
           <w:rFonts w:eastAsia="Times New Roman" w:cs="Times New Roman"/>
           <w:i w:val="false"/>
           <w:iCs w:val="false"/>
@@ -17947,7 +17947,7 @@
       </w:r>
       <w:r>
         <w:rPr>
-          <w:rStyle w:val="FootnoteCharacters"/>
+          <w:rStyle w:val="FootnoteCharactersuser"/>
           <w:rFonts w:eastAsia="Liberation Serif" w:cs="Liberation Serif"/>
           <w:i w:val="false"/>
           <w:iCs w:val="false"/>
@@ -17961,7 +17961,7 @@
       </w:r>
       <w:r>
         <w:rPr>
-          <w:rStyle w:val="FootnoteCharacters"/>
+          <w:rStyle w:val="FootnoteCharactersuser"/>
           <w:rFonts w:eastAsia="Times New Roman" w:cs="Times New Roman"/>
           <w:i w:val="false"/>
           <w:iCs w:val="false"/>
@@ -29390,7 +29390,15 @@
       <w:commentRangeStart w:id="21"/>
       <w:r>
         <w:rPr/>
-        <w:t xml:space="preserve">A machine-readable Biblical and literary corpus constitutes the primary product of the technical labor described. ALGO From plain-text files I created a fully indexed, searchable database of digital texts of the Russian Synodal Bible and Gor’kii’s novels </w:t>
+        <w:t xml:space="preserve">A machine-readable Biblical and literary corpus constitutes the primary product of the technical labor described. </w:t>
+      </w:r>
+      <w:r>
+        <w:rPr/>
+        <w:t>The underlying algorithm to discover textual crossover is under development and will also be a valuable outcome of the project.</w:t>
+      </w:r>
+      <w:r>
+        <w:rPr/>
+        <w:t xml:space="preserve"> From plain-text files I created a fully indexed, searchable database of digital texts of the Russian Synodal Bible and Gor’kii’s novels </w:t>
       </w:r>
       <w:r>
         <w:rPr>
@@ -30634,7 +30642,369 @@
       </w:pPr>
       <w:r>
         <w:rPr/>
-        <w:tab/>
+      </w:r>
+      <w:r>
+        <w:br w:type="page"/>
+      </w:r>
+    </w:p>
+    <w:p>
+      <w:pPr>
+        <w:pStyle w:val="Normal"/>
+        <w:spacing w:lineRule="auto" w:line="276"/>
+        <w:ind w:hanging="0"/>
+        <w:jc w:val="center"/>
+        <w:rPr>
+          <w:rFonts w:ascii="Times New Roman" w:hAnsi="Times New Roman" w:eastAsia="Times New Roman" w:cs="Times New Roman"/>
+          <w:sz w:val="24"/>
+          <w:szCs w:val="24"/>
+          <w:u w:val="none"/>
+        </w:rPr>
+      </w:pPr>
+      <w:r>
+        <w:rPr>
+          <w:rFonts w:eastAsia="Times New Roman" w:cs="Times New Roman" w:ascii="Times New Roman" w:hAnsi="Times New Roman"/>
+          <w:sz w:val="24"/>
+          <w:szCs w:val="24"/>
+          <w:u w:val="none"/>
+        </w:rPr>
+        <w:t>Conclusion:</w:t>
+      </w:r>
+      <w:r>
+        <w:rPr/>
+        <w:br/>
+      </w:r>
+      <w:r>
+        <w:rPr>
+          <w:rFonts w:eastAsia="Times New Roman" w:cs="Times New Roman" w:ascii="Times New Roman" w:hAnsi="Times New Roman"/>
+          <w:sz w:val="24"/>
+          <w:szCs w:val="24"/>
+          <w:u w:val="none"/>
+        </w:rPr>
+        <w:t>An Intermezzo on Capri</w:t>
+        <w:br/>
+      </w:r>
+    </w:p>
+    <w:p>
+      <w:pPr>
+        <w:pStyle w:val="Normal"/>
+        <w:widowControl/>
+        <w:suppressAutoHyphens w:val="true"/>
+        <w:overflowPunct w:val="false"/>
+        <w:bidi w:val="0"/>
+        <w:spacing w:lineRule="auto" w:line="276" w:before="0" w:after="160"/>
+        <w:ind w:hanging="0" w:start="2880" w:end="0"/>
+        <w:jc w:val="end"/>
+        <w:rPr>
+          <w:rFonts w:ascii="Times New Roman" w:hAnsi="Times New Roman" w:eastAsia="Times New Roman" w:cs="Times New Roman"/>
+          <w:b w:val="false"/>
+          <w:bCs w:val="false"/>
+          <w:i w:val="false"/>
+          <w:i w:val="false"/>
+          <w:iCs w:val="false"/>
+          <w:sz w:val="24"/>
+          <w:szCs w:val="24"/>
+          <w:u w:val="none"/>
+          <w:lang w:val="en-US"/>
+        </w:rPr>
+      </w:pPr>
+      <w:r>
+        <w:rPr>
+          <w:rFonts w:eastAsia="Times New Roman" w:cs="Times New Roman" w:ascii="Times New Roman" w:hAnsi="Times New Roman"/>
+          <w:b w:val="false"/>
+          <w:bCs w:val="false"/>
+          <w:i w:val="false"/>
+          <w:iCs w:val="false"/>
+          <w:sz w:val="24"/>
+          <w:szCs w:val="24"/>
+          <w:u w:val="none"/>
+          <w:lang w:val="en-US"/>
+        </w:rPr>
+        <w:t>“</w:t>
+      </w:r>
+      <w:r>
+        <w:rPr>
+          <w:rFonts w:eastAsia="Times New Roman" w:cs="Times New Roman" w:ascii="Times New Roman" w:hAnsi="Times New Roman"/>
+          <w:b w:val="false"/>
+          <w:bCs w:val="false"/>
+          <w:i w:val="false"/>
+          <w:iCs w:val="false"/>
+          <w:sz w:val="24"/>
+          <w:szCs w:val="24"/>
+          <w:u w:val="none"/>
+          <w:lang w:val="en-US"/>
+        </w:rPr>
+        <w:t>The Russian people have forged a sacred union with Freedom. Let us believe that from this alliance, new strong individuals will be born in our nation that has been tormented both physically and spiritually. However, we must not forget that we are all people of yesterday, and that the great task of the nation's revival lies in the hands of those shaped by the harsh lessons of the past, in an atmosphere of mutual distrust, disregard for others, and grotesque selfishness.”</w:t>
+      </w:r>
+      <w:r>
+        <w:rPr/>
+        <w:br/>
+      </w:r>
+      <w:r>
+        <w:rPr>
+          <w:rFonts w:eastAsia="Times New Roman" w:cs="Times New Roman" w:ascii="Times New Roman" w:hAnsi="Times New Roman"/>
+          <w:b w:val="false"/>
+          <w:bCs w:val="false"/>
+          <w:i w:val="false"/>
+          <w:iCs w:val="false"/>
+          <w:sz w:val="24"/>
+          <w:szCs w:val="24"/>
+          <w:u w:val="none"/>
+          <w:lang w:val="en-US"/>
+        </w:rPr>
+        <w:t>—Gor’kii, opening words of “Untimely Thoughts,” (1917)</w:t>
+      </w:r>
+      <w:r>
+        <w:rPr>
+          <w:rStyle w:val="FootnoteReference"/>
+          <w:rFonts w:eastAsia="Times New Roman" w:cs="Times New Roman" w:ascii="Times New Roman" w:hAnsi="Times New Roman"/>
+          <w:b w:val="false"/>
+          <w:bCs w:val="false"/>
+          <w:i w:val="false"/>
+          <w:iCs w:val="false"/>
+          <w:sz w:val="24"/>
+          <w:szCs w:val="24"/>
+          <w:u w:val="none"/>
+          <w:lang w:val="en-US"/>
+        </w:rPr>
+        <w:footnoteReference w:id="452"/>
+      </w:r>
+    </w:p>
+    <w:p>
+      <w:pPr>
+        <w:pStyle w:val="Normal"/>
+        <w:widowControl/>
+        <w:suppressAutoHyphens w:val="true"/>
+        <w:overflowPunct w:val="false"/>
+        <w:bidi w:val="0"/>
+        <w:spacing w:lineRule="auto" w:line="276" w:before="0" w:after="160"/>
+        <w:ind w:hanging="0" w:start="2880" w:end="0"/>
+        <w:jc w:val="end"/>
+        <w:rPr>
+          <w:rFonts w:ascii="Times New Roman" w:hAnsi="Times New Roman" w:eastAsia="Times New Roman" w:cs="Times New Roman"/>
+          <w:b w:val="false"/>
+          <w:bCs w:val="false"/>
+          <w:i w:val="false"/>
+          <w:i w:val="false"/>
+          <w:iCs w:val="false"/>
+          <w:sz w:val="24"/>
+          <w:szCs w:val="24"/>
+          <w:u w:val="none"/>
+          <w:lang w:val="en-US"/>
+        </w:rPr>
+      </w:pPr>
+      <w:r>
+        <w:rPr>
+          <w:rFonts w:eastAsia="Times New Roman" w:cs="Times New Roman" w:ascii="Times New Roman" w:hAnsi="Times New Roman"/>
+          <w:b w:val="false"/>
+          <w:bCs w:val="false"/>
+          <w:i w:val="false"/>
+          <w:iCs w:val="false"/>
+          <w:sz w:val="24"/>
+          <w:szCs w:val="24"/>
+          <w:u w:val="none"/>
+          <w:lang w:val="en-US"/>
+        </w:rPr>
+        <w:t>“</w:t>
+      </w:r>
+      <w:r>
+        <w:rPr>
+          <w:rFonts w:eastAsia="Times New Roman" w:cs="Times New Roman" w:ascii="Times New Roman" w:hAnsi="Times New Roman"/>
+          <w:b w:val="false"/>
+          <w:bCs w:val="false"/>
+          <w:i w:val="false"/>
+          <w:iCs w:val="false"/>
+          <w:sz w:val="24"/>
+          <w:szCs w:val="24"/>
+          <w:u w:val="none"/>
+          <w:lang w:val="en-US"/>
+        </w:rPr>
+        <w:t>The gift of all gifts is the truth... Now the vagabonds are shod, and now the private professors are destitute. Has it become better in Russia? Have the sprouts of the Social-Democratic School, with Rector Gor’kii at its helm, transplanted from under the blue Capri sky to the Russian soil, grown as the conscientious gardener dreamed?..”</w:t>
+      </w:r>
+      <w:r>
+        <w:rPr/>
+        <w:br/>
+      </w:r>
+      <w:r>
+        <w:rPr>
+          <w:rFonts w:eastAsia="Times New Roman" w:cs="Times New Roman" w:ascii="Times New Roman" w:hAnsi="Times New Roman"/>
+          <w:b w:val="false"/>
+          <w:bCs w:val="false"/>
+          <w:i w:val="false"/>
+          <w:iCs w:val="false"/>
+          <w:sz w:val="24"/>
+          <w:szCs w:val="24"/>
+          <w:u w:val="none"/>
+          <w:lang w:val="en-US"/>
+        </w:rPr>
+        <w:t>–I. I. Aikhenval’d, “Maksim Gor’kii” (1918)</w:t>
+      </w:r>
+      <w:r>
+        <w:rPr>
+          <w:rStyle w:val="FootnoteReference"/>
+          <w:rFonts w:eastAsia="Times New Roman" w:cs="Times New Roman" w:ascii="Times New Roman" w:hAnsi="Times New Roman"/>
+          <w:b w:val="false"/>
+          <w:bCs w:val="false"/>
+          <w:i w:val="false"/>
+          <w:iCs w:val="false"/>
+          <w:sz w:val="24"/>
+          <w:szCs w:val="24"/>
+          <w:u w:val="none"/>
+          <w:lang w:val="en-US"/>
+        </w:rPr>
+        <w:footnoteReference w:id="453"/>
+      </w:r>
+    </w:p>
+    <w:p>
+      <w:pPr>
+        <w:pStyle w:val="Normal"/>
+        <w:widowControl/>
+        <w:suppressAutoHyphens w:val="true"/>
+        <w:overflowPunct w:val="false"/>
+        <w:bidi w:val="0"/>
+        <w:spacing w:lineRule="auto" w:line="276" w:before="0" w:after="160"/>
+        <w:ind w:hanging="0" w:start="2880" w:end="0"/>
+        <w:jc w:val="end"/>
+        <w:rPr>
+          <w:rFonts w:ascii="Times New Roman" w:hAnsi="Times New Roman" w:eastAsia="Times New Roman" w:cs="Times New Roman"/>
+          <w:b w:val="false"/>
+          <w:bCs w:val="false"/>
+          <w:i w:val="false"/>
+          <w:i w:val="false"/>
+          <w:iCs w:val="false"/>
+          <w:sz w:val="24"/>
+          <w:szCs w:val="24"/>
+          <w:u w:val="none"/>
+          <w:lang w:val="en-US"/>
+        </w:rPr>
+      </w:pPr>
+      <w:r>
+        <w:rPr>
+          <w:rFonts w:eastAsia="Times New Roman" w:cs="Times New Roman" w:ascii="Times New Roman" w:hAnsi="Times New Roman"/>
+          <w:b w:val="false"/>
+          <w:bCs w:val="false"/>
+          <w:i w:val="false"/>
+          <w:iCs w:val="false"/>
+          <w:sz w:val="24"/>
+          <w:szCs w:val="24"/>
+          <w:u w:val="none"/>
+          <w:lang w:val="en-US"/>
+        </w:rPr>
+      </w:r>
+    </w:p>
+    <w:p>
+      <w:pPr>
+        <w:pStyle w:val="Normal"/>
+        <w:suppressLineNumbers w:val="0"/>
+        <w:bidi w:val="0"/>
+        <w:spacing w:lineRule="auto" w:line="480" w:before="0" w:after="160"/>
+        <w:ind w:firstLine="720" w:start="0" w:end="0"/>
+        <w:jc w:val="start"/>
+        <w:rPr>
+          <w:rFonts w:ascii="Times New Roman" w:hAnsi="Times New Roman" w:eastAsia="Times New Roman" w:cs="Times New Roman"/>
+          <w:i w:val="false"/>
+          <w:i w:val="false"/>
+          <w:iCs w:val="false"/>
+          <w:sz w:val="24"/>
+          <w:szCs w:val="24"/>
+          <w:u w:val="none"/>
+        </w:rPr>
+      </w:pPr>
+      <w:r>
+        <w:rPr>
+          <w:rFonts w:eastAsia="Times New Roman" w:cs="Times New Roman" w:ascii="Times New Roman" w:hAnsi="Times New Roman"/>
+          <w:sz w:val="24"/>
+          <w:szCs w:val="24"/>
+          <w:u w:val="none"/>
+        </w:rPr>
+        <w:t xml:space="preserve">Once the October Revolution had taken place, the transpositions Gor’kii had been trying to write into existence could also be realized, but would they? Since </w:t>
+      </w:r>
+      <w:r>
+        <w:rPr>
+          <w:rFonts w:eastAsia="Times New Roman" w:cs="Times New Roman" w:ascii="Times New Roman" w:hAnsi="Times New Roman"/>
+          <w:i/>
+          <w:iCs/>
+          <w:sz w:val="24"/>
+          <w:szCs w:val="24"/>
+          <w:u w:val="none"/>
+        </w:rPr>
+        <w:t>Mother</w:t>
+      </w:r>
+      <w:r>
+        <w:rPr>
+          <w:rFonts w:eastAsia="Times New Roman" w:cs="Times New Roman" w:ascii="Times New Roman" w:hAnsi="Times New Roman"/>
+          <w:i w:val="false"/>
+          <w:iCs w:val="false"/>
+          <w:sz w:val="24"/>
+          <w:szCs w:val="24"/>
+          <w:u w:val="none"/>
+        </w:rPr>
+        <w:t xml:space="preserve">—and likely before—he </w:t>
+      </w:r>
+      <w:r>
+        <w:rPr>
+          <w:rFonts w:eastAsia="Times New Roman" w:cs="Times New Roman" w:ascii="Times New Roman" w:hAnsi="Times New Roman"/>
+          <w:i w:val="false"/>
+          <w:iCs w:val="false"/>
+          <w:sz w:val="24"/>
+          <w:szCs w:val="24"/>
+          <w:u w:val="none"/>
+        </w:rPr>
+        <w:t>had</w:t>
+      </w:r>
+      <w:r>
+        <w:rPr>
+          <w:rFonts w:eastAsia="Times New Roman" w:cs="Times New Roman" w:ascii="Times New Roman" w:hAnsi="Times New Roman"/>
+          <w:i w:val="false"/>
+          <w:iCs w:val="false"/>
+          <w:sz w:val="24"/>
+          <w:szCs w:val="24"/>
+          <w:u w:val="none"/>
+        </w:rPr>
+        <w:t xml:space="preserve"> hoped that when the Empire was no more, the “people of yesterday” would become “new strong individuals,” as Pavel does. As we know in hindsight, however, even if some in the RFSFR and USSR could and would rise to the occasion as Gor’kii wished, </w:t>
+      </w:r>
+      <w:r>
+        <w:rPr>
+          <w:rFonts w:eastAsia="Times New Roman" w:cs="Times New Roman" w:ascii="Times New Roman" w:hAnsi="Times New Roman"/>
+          <w:i w:val="false"/>
+          <w:iCs w:val="false"/>
+          <w:sz w:val="24"/>
+          <w:szCs w:val="24"/>
+          <w:u w:val="none"/>
+        </w:rPr>
+        <w:t>those in power</w:t>
+      </w:r>
+      <w:r>
+        <w:rPr>
+          <w:rFonts w:eastAsia="Times New Roman" w:cs="Times New Roman" w:ascii="Times New Roman" w:hAnsi="Times New Roman"/>
+          <w:i w:val="false"/>
+          <w:iCs w:val="false"/>
+          <w:sz w:val="24"/>
+          <w:szCs w:val="24"/>
+          <w:u w:val="none"/>
+        </w:rPr>
+        <w:t xml:space="preserve"> remained weakened by the “harsh lessons of the past” and thus prone to old ways. </w:t>
+      </w:r>
+      <w:r>
+        <w:rPr>
+          <w:rFonts w:eastAsia="Times New Roman" w:cs="Times New Roman" w:ascii="Times New Roman" w:hAnsi="Times New Roman"/>
+          <w:i/>
+          <w:iCs/>
+          <w:sz w:val="24"/>
+          <w:szCs w:val="24"/>
+          <w:u w:val="none"/>
+        </w:rPr>
+        <w:t>A Revolutionary Gospel</w:t>
+      </w:r>
+      <w:r>
+        <w:rPr>
+          <w:rFonts w:eastAsia="Times New Roman" w:cs="Times New Roman" w:ascii="Times New Roman" w:hAnsi="Times New Roman"/>
+          <w:i w:val="false"/>
+          <w:iCs w:val="false"/>
+          <w:sz w:val="24"/>
+          <w:szCs w:val="24"/>
+          <w:u w:val="none"/>
+        </w:rPr>
+        <w:t>’s first four chapters aim to define the “lessons” to which Gor’kii alludes here, his proclamations of “Truth” based on decades of witnessing history up close and personally. Such is “the gift of all gifts” about which Aikhenval’d wrote: change is possible, but there is no outrunning the past. Gor’kii knew this truth better than most around him, though that did not stop him from trying to fundamentally change human nature. The Capri School and its “sprouts” were the new Soviet people Gor’kii had been hoping to sow across the country. Unfortunately, Russian soil was simply too hostile for these ideas to take root.</w:t>
       </w:r>
     </w:p>
     <w:sectPr>
@@ -30661,7 +31031,7 @@
   <w:comment w:id="0" w:author="Clowes, Edith W (eec3c)" w:date="2022-09-15T09:49:09Z" w:initials="C(">
     <w:p>
       <w:pPr>
-        <w:overflowPunct w:val="false"/>
+        <w:overflowPunct w:val="true"/>
         <w:bidi w:val="0"/>
         <w:spacing w:lineRule="auto" w:line="240" w:before="0" w:after="0"/>
         <w:rPr/>
@@ -30681,7 +31051,7 @@
   <w:comment w:id="1" w:author="Thompson, Aaron Michael (amt3ad)" w:date="2022-04-07T11:57:41Z" w:initials="T(">
     <w:p>
       <w:pPr>
-        <w:overflowPunct w:val="false"/>
+        <w:overflowPunct w:val="true"/>
         <w:bidi w:val="0"/>
         <w:spacing w:lineRule="auto" w:line="240"/>
         <w:rPr/>
@@ -30699,7 +31069,7 @@
   <w:comment w:id="2" w:author="Clowes, Edith W (eec3c)" w:date="2022-04-07T10:25:53Z" w:initials="C(">
     <w:p>
       <w:pPr>
-        <w:overflowPunct w:val="false"/>
+        <w:overflowPunct w:val="true"/>
         <w:bidi w:val="0"/>
         <w:spacing w:lineRule="auto" w:line="240"/>
         <w:rPr/>
@@ -30717,7 +31087,7 @@
   <w:comment w:id="3" w:author="Clowes, Edith W (eec3c)" w:date="2023-03-02T10:07:41Z" w:initials="C(">
     <w:p>
       <w:pPr>
-        <w:overflowPunct w:val="false"/>
+        <w:overflowPunct w:val="true"/>
         <w:bidi w:val="0"/>
         <w:spacing w:lineRule="auto" w:line="240" w:before="0" w:after="0"/>
         <w:rPr/>
@@ -30737,7 +31107,7 @@
   <w:comment w:id="4" w:author="Clowes, Edith W (eec3c)" w:date="2023-02-23T12:52:01Z" w:initials="C(">
     <w:p>
       <w:pPr>
-        <w:overflowPunct w:val="false"/>
+        <w:overflowPunct w:val="true"/>
         <w:bidi w:val="0"/>
         <w:spacing w:lineRule="auto" w:line="240" w:before="0" w:after="0"/>
         <w:rPr/>
@@ -30757,7 +31127,7 @@
   <w:comment w:id="5" w:author="Clowes, Edith W (eec3c)" w:date="2023-03-02T11:54:11Z" w:initials="C(">
     <w:p>
       <w:pPr>
-        <w:overflowPunct w:val="false"/>
+        <w:overflowPunct w:val="true"/>
         <w:bidi w:val="0"/>
         <w:spacing w:lineRule="auto" w:line="240" w:before="0" w:after="0"/>
         <w:rPr/>
@@ -30777,7 +31147,7 @@
   <w:comment w:id="6" w:author="Clowes, Edith W (eec3c)" w:date="2024-04-05T13:15:47Z" w:initials="C(">
     <w:p>
       <w:pPr>
-        <w:overflowPunct w:val="true"/>
+        <w:overflowPunct w:val="false"/>
         <w:spacing w:lineRule="auto" w:line="240" w:before="0" w:after="0"/>
         <w:rPr/>
       </w:pPr>
@@ -30796,7 +31166,7 @@
   <w:comment w:id="7" w:author="Clowes, Edith W (eec3c)" w:date="2024-04-05T15:12:05Z" w:initials="C(">
     <w:p>
       <w:pPr>
-        <w:overflowPunct w:val="true"/>
+        <w:overflowPunct w:val="false"/>
         <w:spacing w:lineRule="auto" w:line="240" w:before="0" w:after="0"/>
         <w:rPr/>
       </w:pPr>
@@ -30815,7 +31185,7 @@
   <w:comment w:id="8" w:author="Clowes, Edith W (eec3c)" w:date="2024-04-05T15:19:25Z" w:initials="C(">
     <w:p>
       <w:pPr>
-        <w:overflowPunct w:val="true"/>
+        <w:overflowPunct w:val="false"/>
         <w:spacing w:lineRule="auto" w:line="240" w:before="0" w:after="0"/>
         <w:rPr/>
       </w:pPr>
@@ -30834,7 +31204,7 @@
   <w:comment w:id="9" w:author="Clowes, Edith W (eec3c)" w:date="2024-04-05T15:20:06Z" w:initials="C(">
     <w:p>
       <w:pPr>
-        <w:overflowPunct w:val="true"/>
+        <w:overflowPunct w:val="false"/>
         <w:spacing w:lineRule="auto" w:line="240" w:before="0" w:after="0"/>
         <w:rPr/>
       </w:pPr>
@@ -30853,7 +31223,7 @@
   <w:comment w:id="10" w:author="Clowes, Edith W (eec3c)" w:date="2024-04-05T15:24:29Z" w:initials="C(">
     <w:p>
       <w:pPr>
-        <w:overflowPunct w:val="true"/>
+        <w:overflowPunct w:val="false"/>
         <w:spacing w:lineRule="auto" w:line="240" w:before="0" w:after="0"/>
         <w:rPr/>
       </w:pPr>
@@ -30872,7 +31242,7 @@
   <w:comment w:id="11" w:author="Clowes, Edith W (eec3c)" w:date="2024-04-05T15:28:54Z" w:initials="C(">
     <w:p>
       <w:pPr>
-        <w:overflowPunct w:val="true"/>
+        <w:overflowPunct w:val="false"/>
         <w:spacing w:lineRule="auto" w:line="240" w:before="0" w:after="0"/>
         <w:rPr/>
       </w:pPr>
@@ -30891,7 +31261,7 @@
   <w:comment w:id="13" w:author="Clowes, Edith W (eec3c)" w:date="2024-03-07T12:00:14Z" w:initials="C(">
     <w:p>
       <w:pPr>
-        <w:overflowPunct w:val="true"/>
+        <w:overflowPunct w:val="false"/>
         <w:spacing w:lineRule="auto" w:line="240" w:before="0" w:after="0"/>
         <w:rPr/>
       </w:pPr>
@@ -30910,7 +31280,7 @@
   <w:comment w:id="12" w:author="Thompson, Aaron Michael (amt3ad)" w:date="2024-03-07T12:55:25Z" w:initials="T(">
     <w:p>
       <w:pPr>
-        <w:overflowPunct w:val="true"/>
+        <w:overflowPunct w:val="false"/>
         <w:spacing w:lineRule="auto" w:line="240" w:before="0" w:after="0"/>
         <w:rPr/>
       </w:pPr>
@@ -30929,7 +31299,7 @@
   <w:comment w:id="14" w:author="Clowes, Edith W (eec3c)" w:date="2024-03-07T12:01:13Z" w:initials="C(">
     <w:p>
       <w:pPr>
-        <w:overflowPunct w:val="true"/>
+        <w:overflowPunct w:val="false"/>
         <w:spacing w:lineRule="auto" w:line="240" w:before="0" w:after="0"/>
         <w:rPr/>
       </w:pPr>
@@ -30948,7 +31318,7 @@
   <w:comment w:id="15" w:author="Clowes, Edith W (eec3c)" w:date="2024-04-18T10:57:07Z" w:initials="C(">
     <w:p>
       <w:pPr>
-        <w:overflowPunct w:val="true"/>
+        <w:overflowPunct w:val="false"/>
         <w:spacing w:lineRule="auto" w:line="240" w:before="0" w:after="0"/>
         <w:rPr/>
       </w:pPr>
@@ -30967,7 +31337,7 @@
   <w:comment w:id="16" w:author="Clowes, Edith W (eec3c)" w:date="2024-04-18T10:58:04Z" w:initials="C(">
     <w:p>
       <w:pPr>
-        <w:overflowPunct w:val="true"/>
+        <w:overflowPunct w:val="false"/>
         <w:spacing w:lineRule="auto" w:line="240" w:before="0" w:after="0"/>
         <w:rPr/>
       </w:pPr>
@@ -30986,7 +31356,7 @@
   <w:comment w:id="17" w:author="Clowes, Edith W (eec3c)" w:date="2024-04-18T11:01:15Z" w:initials="C(">
     <w:p>
       <w:pPr>
-        <w:overflowPunct w:val="true"/>
+        <w:overflowPunct w:val="false"/>
         <w:spacing w:lineRule="auto" w:line="240" w:before="0" w:after="0"/>
         <w:rPr/>
       </w:pPr>
@@ -31005,7 +31375,7 @@
   <w:comment w:id="18" w:author="Clowes, Edith W (eec3c)" w:date="2024-04-18T11:03:24Z" w:initials="C(">
     <w:p>
       <w:pPr>
-        <w:overflowPunct w:val="true"/>
+        <w:overflowPunct w:val="false"/>
         <w:spacing w:lineRule="auto" w:line="240" w:before="0" w:after="0"/>
         <w:rPr/>
       </w:pPr>
@@ -31024,7 +31394,7 @@
   <w:comment w:id="19" w:author="Clowes, Edith W (eec3c)" w:date="2024-04-18T11:05:30Z" w:initials="C(">
     <w:p>
       <w:pPr>
-        <w:overflowPunct w:val="true"/>
+        <w:overflowPunct w:val="false"/>
         <w:spacing w:lineRule="auto" w:line="240" w:before="0" w:after="0"/>
         <w:rPr/>
       </w:pPr>
@@ -31041,7 +31411,7 @@
     </w:p>
     <w:p>
       <w:pPr>
-        <w:overflowPunct w:val="true"/>
+        <w:overflowPunct w:val="false"/>
         <w:spacing w:lineRule="auto" w:line="240" w:before="0" w:after="0"/>
         <w:rPr/>
       </w:pPr>
@@ -31060,7 +31430,7 @@
   <w:comment w:id="20" w:author="Clowes, Edith W (eec3c)" w:date="2024-04-18T11:10:51Z" w:initials="C(">
     <w:p>
       <w:pPr>
-        <w:overflowPunct w:val="true"/>
+        <w:overflowPunct w:val="false"/>
         <w:spacing w:lineRule="auto" w:line="240" w:before="0" w:after="0"/>
         <w:rPr/>
       </w:pPr>
@@ -31079,7 +31449,7 @@
   <w:comment w:id="22" w:author="Clowes, Edith W (eec3c)" w:date="2024-05-02T11:26:31Z" w:initials="C(">
     <w:p>
       <w:pPr>
-        <w:overflowPunct w:val="true"/>
+        <w:overflowPunct w:val="false"/>
         <w:spacing w:lineRule="auto" w:line="240" w:before="0" w:after="0"/>
         <w:rPr/>
       </w:pPr>
@@ -31094,7 +31464,7 @@
     </w:p>
     <w:p>
       <w:pPr>
-        <w:overflowPunct w:val="true"/>
+        <w:overflowPunct w:val="false"/>
         <w:spacing w:lineRule="auto" w:line="240" w:before="0" w:after="0"/>
         <w:rPr/>
       </w:pPr>
@@ -31108,7 +31478,7 @@
     </w:p>
     <w:p>
       <w:pPr>
-        <w:overflowPunct w:val="true"/>
+        <w:overflowPunct w:val="false"/>
         <w:spacing w:lineRule="auto" w:line="240" w:before="0" w:after="0"/>
         <w:rPr/>
       </w:pPr>
@@ -31125,7 +31495,7 @@
   <w:comment w:id="21" w:author="Clowes, Edith W (eec3c)" w:date="2024-09-22T10:11:36Z" w:initials="C(">
     <w:p>
       <w:pPr>
-        <w:overflowPunct w:val="true"/>
+        <w:overflowPunct w:val="false"/>
         <w:spacing w:lineRule="auto" w:line="240" w:before="0" w:after="0"/>
         <w:rPr/>
       </w:pPr>
@@ -44431,7 +44801,7 @@
         </w:rPr>
         <w:t>Il n'y a qu'un problème philosophique vraiment sérieux : c'est le suicide</w:t>
       </w:r>
-      <w:bookmarkStart w:id="38" w:name="cite_ref-1_Copy_1_Copy_1_Copy_1"/>
+      <w:bookmarkStart w:id="38" w:name="cite_ref-1_Copy_1_Copy_1_Copy_1_Copy_1"/>
       <w:bookmarkEnd w:id="38"/>
       <w:r>
         <w:rPr>
@@ -47501,6 +47871,66 @@
       <w:r>
         <w:rPr/>
         <w:t xml:space="preserve"> (Bellvue, WA, 2011).</w:t>
+      </w:r>
+    </w:p>
+  </w:footnote>
+  <w:footnote w:id="452">
+    <w:p>
+      <w:pPr>
+        <w:pStyle w:val="FootnoteText"/>
+        <w:bidi w:val="0"/>
+        <w:rPr>
+          <w:rFonts w:ascii="Liberation Serif" w:hAnsi="Liberation Serif"/>
+        </w:rPr>
+      </w:pPr>
+      <w:r>
+        <w:rPr>
+          <w:rStyle w:val="FootnoteCharacters"/>
+        </w:rPr>
+        <w:footnoteRef/>
+      </w:r>
+      <w:r>
+        <w:rPr/>
+        <w:tab/>
+        <w:t xml:space="preserve"> </w:t>
+      </w:r>
+      <w:r>
+        <w:rPr/>
+        <w:t xml:space="preserve">Maksim Gorʹkii, Nesvoevremennye mysli: Zametki o revoliutsii i kul’ture, ed. Iosif Irmovič Vajnberg (Sovetskii pisatel’, 1990), 76. “Русский народ обвенчался со Свободой. Будем верить, что от этого союза в нашей стране, измученной и физически, и духовно, родятся новые сильные люди. Будем крепко верить, что в русском человеке разгорятся ярким огнем силы его разума и воли, силы, погашенные и подавленные вековым гнетом полицейского строя жизни. Но нам не следует забывать, что все мы — люди вчерашнего дня и что великое дело возрождения страны в руках людей, воспитанных тяжкими впечатлениями прошлого в духе недоверия друг к другу, неуважения к ближнему и уродливого эгоизма.” </w:t>
+      </w:r>
+    </w:p>
+  </w:footnote>
+  <w:footnote w:id="453">
+    <w:p>
+      <w:pPr>
+        <w:pStyle w:val="FootnoteText"/>
+        <w:bidi w:val="0"/>
+        <w:rPr/>
+      </w:pPr>
+      <w:r>
+        <w:rPr>
+          <w:rStyle w:val="FootnoteCharacters"/>
+        </w:rPr>
+        <w:footnoteRef/>
+      </w:r>
+      <w:r>
+        <w:rPr/>
+        <w:tab/>
+        <w:t xml:space="preserve"> </w:t>
+      </w:r>
+      <w:r>
+        <w:rPr/>
+        <w:t xml:space="preserve">Iulii Isaevich Aikhenval’d, </w:t>
+      </w:r>
+      <w:r>
+        <w:rPr>
+          <w:i/>
+        </w:rPr>
+        <w:t>Siluety Russkikh pisatelei: Noveishaia literatura</w:t>
+      </w:r>
+      <w:r>
+        <w:rPr/>
+        <w:t>, 4th ed., vol. 3 (Berlin: Slovo, 1923), 233. “Подарок всех подарков - правда. ... Теперь босяки обуты, теперь приват-доценты обездолены. Стало ли лучше в России? Из-под голубого каприйского неба на русскую почву перенесенные ростки социал-демократической школы, с ректором Горьким во главе, так ли взошли, как об этом мечтал добросовестный садовник?..”</w:t>
       </w:r>
     </w:p>
   </w:footnote>
@@ -47579,7 +48009,7 @@
     </w:r>
     <w:r>
       <w:rPr/>
-      <w:t>2</w:t>
+      <w:t>32</w:t>
     </w:r>
     <w:r>
       <w:rPr/>
@@ -47712,15 +48142,15 @@
       <w:u w:val="single"/>
     </w:rPr>
   </w:style>
-  <w:style w:type="character" w:styleId="FootnoteCharacters">
-    <w:name w:val="Footnote Characters"/>
+  <w:style w:type="character" w:styleId="FootnoteCharactersuser">
+    <w:name w:val="Footnote Characters (user)"/>
     <w:qFormat/>
     <w:rPr>
       <w:vertAlign w:val="superscript"/>
     </w:rPr>
   </w:style>
-  <w:style w:type="character" w:styleId="FootnoteCharactersuser">
-    <w:name w:val="Footnote Characters (user)"/>
+  <w:style w:type="character" w:styleId="FootnoteCharacters">
+    <w:name w:val="Footnote Characters"/>
     <w:qFormat/>
     <w:rPr>
       <w:vertAlign w:val="superscript"/>
@@ -47739,15 +48169,15 @@
       <w:u w:val="single"/>
     </w:rPr>
   </w:style>
-  <w:style w:type="character" w:styleId="EndnoteCharacters">
-    <w:name w:val="Endnote Characters"/>
+  <w:style w:type="character" w:styleId="EndnoteCharactersuser">
+    <w:name w:val="Endnote Characters (user)"/>
     <w:qFormat/>
     <w:rPr>
       <w:vertAlign w:val="superscript"/>
     </w:rPr>
   </w:style>
-  <w:style w:type="character" w:styleId="EndnoteCharactersuser">
-    <w:name w:val="Endnote Characters (user)"/>
+  <w:style w:type="character" w:styleId="EndnoteCharacters">
+    <w:name w:val="Endnote Characters"/>
     <w:qFormat/>
     <w:rPr>
       <w:vertAlign w:val="superscript"/>

</xml_diff>